<commit_message>
Add analysis methods section and experiment dates to the merged report
채점 기준 대조에서 발견한 누락 두 건을 보완했다. 4,874단어.

Two omissions found when auditing against the marking guide. 4,874 words.

1) "Statistical methods" 항목 대응 — 기준은 사용한 통계의 기술, 다른
   방법 대신 그것을 고른 이유, 소프트웨어와 버전, 분석 스크립트 보관처를
   요구한다. 통계 판본을 본문에서 뺀 결과 이 항목을 충족하는 서술이
   사라져 있었다. 2.8 Analysis를 신설해 통계 기호 없이 충족시켰다:
   - 짝지어 비교한 방식과 이유
   - 유의성 검정을 하지 않은 것이 누락이 아니라 선택임을 명시
     (반복 없음 -> 오차항을 가정해야 함 -> 8bit를 경험적 기준자로 사용)
   - loss 차이를 상대 %로 환산한 이유(지수 변환이 기준값 높은 조건의
     차이를 부풀림) — 기준의 "transformations or derived data" 항목
   - Python 3.11.15, numpy 2.4.6, rouge-score 0.1.2, matplotlib 3.11.1
   - analyze_interaction.py / plot_results.py 보관처
2) "Material" 항목이 요구하는 수집 날짜 — 2.7에 18조합 2026-09-03,
   alpha=100 6조합 2026-09-10(로그 커밋일 기준)을 추가했다.

Data management는 2.9로 번호가 밀렸다.

Co-Authored-By: Claude Opus 5 <noreply@anthropic.com>
</commit_message>
<xml_diff>
--- a/reports/Week6_Report_merged.docx
+++ b/reports/Week6_Report_merged.docx
@@ -340,7 +340,7 @@
           <w:i w:val="0"/>
           <w:sz w:val="24"/>
         </w:rPr>
-        <w:t>Runs were executed on AWS EC2 GPU instances in the ap-northeast-2 region, each using a single NVIDIA A10G (23,028 MiB) under driver 595.91.07 with CUDA 13.2, on Ubuntu with the 7.0.0-1011-aws x86_64 kernel. The 18 runs at alpha = 0.1, 1 and 10 were executed in one environment; the six alpha = 100 runs were executed later in a separately provisioned environment running Python 3.13.15 with torch 2.14.0, transformers 5.16.1, peft 0.20.0, bitsandbytes 0.50.2, flwr 1.36.0 [7], datasets 5.0.1, tokenizers 0.23.2, accelerate 1.14.0, numpy 2.5.3 and rouge-score 0.1.2, at repository commit 7e8a7fa. The complete package manifest for that environment is archived in the repository as env_alpha100.txt. The corresponding manifest for the first environment was not captured before that instance was terminated, which is a limitation of the experimental record. The two environments are known to differ: 8-bit rounds took 25.5 minutes in the first and 21.6 minutes in the second, while LoRA and 4-bit round times were unchanged, a pattern consistent with a change in the bitsandbytes kernel implementation. Timing comparisons in this report are therefore restricted to runs from the first environment. All random seeds were fixed at 42. The implementation was verified by an automated suite of 66 tests covering data preparation, partitioning, adapter wiring, aggregation, checkpointing, convergence and the analysis functions.</w:t>
+        <w:t>Runs were executed on AWS EC2 GPU instances in the ap-northeast-2 region, each using a single NVIDIA A10G (23,028 MiB) under driver 595.91.07 with CUDA 13.2, on Ubuntu with the 7.0.0-1011-aws x86_64 kernel. The 18 runs at alpha = 0.1, 1 and 10 were executed in one environment; the six alpha = 100 runs were executed later in a separately provisioned environment running Python 3.13.15 with torch 2.14.0, transformers 5.16.1, peft 0.20.0, bitsandbytes 0.50.2, flwr 1.36.0 [7], datasets 5.0.1, tokenizers 0.23.2, accelerate 1.14.0, numpy 2.5.3 and rouge-score 0.1.2, at repository commit 7e8a7fa. The 18 runs were completed by 3 September 2026 and the six alpha = 100 runs by 10 September 2026, the dates on which their logs were committed to the repository. The complete package manifest for that environment is archived in the repository as env_alpha100.txt. The corresponding manifest for the first environment was not captured before that instance was terminated, which is a limitation of the experimental record. The two environments are known to differ: 8-bit rounds took 25.5 minutes in the first and 21.6 minutes in the second, while LoRA and 4-bit round times were unchanged, a pattern consistent with a change in the bitsandbytes kernel implementation. Timing comparisons in this report are therefore restricted to runs from the first environment. All random seeds were fixed at 42. The implementation was verified by an automated suite of 66 tests covering data preparation, partitioning, adapter wiring, aggregation, checkpointing, convergence and the analysis functions.</w:t>
       </w:r>
     </w:p>
     <w:p>
@@ -351,7 +351,51 @@
           <w:i w:val="0"/>
           <w:sz w:val="26"/>
         </w:rPr>
-        <w:t>2.8 Data management</w:t>
+        <w:t>2.8 Analysis</w:t>
+      </w:r>
+    </w:p>
+    <w:p>
+      <w:r>
+        <w:rPr>
+          <w:rFonts w:ascii="Times New Roman" w:hAnsi="Times New Roman"/>
+          <w:b w:val="0"/>
+          <w:i w:val="0"/>
+          <w:sz w:val="24"/>
+        </w:rPr>
+        <w:t>Comparisons were made by pairing runs rather than by pooling them. Each compressed run was compared against the uncompressed run that shared its aggregation rule and its heterogeneity setting, so that the only difference within a pair was the quantity under study. Differences in perplexity are reported as relative percentages, obtained from the difference in validation loss and then converted: perplexity is the exponential of the loss, so a raw difference in perplexity would be inflated for conditions whose baseline is already higher, and the 4-bit condition would appear to suffer more than it does. ROUGE-L was compared cell by cell and summarised by how many cells moved in each direction, which is meaningful because every run was scored on the same 200 held-out examples.</w:t>
+      </w:r>
+    </w:p>
+    <w:p>
+      <w:r>
+        <w:rPr>
+          <w:rFonts w:ascii="Times New Roman" w:hAnsi="Times New Roman"/>
+          <w:b w:val="0"/>
+          <w:i w:val="0"/>
+          <w:sz w:val="24"/>
+        </w:rPr>
+        <w:t>No significance testing was performed, and this was a deliberate choice rather than an omission. Each of the 24 configurations was run once, so there is no replication from which to estimate run-to-run variability, and any formal test would have had to assume an error term rather than measure one. Variability was instead estimated empirically from the 8-bit condition, whose quality is indistinguishable from the uncompressed baseline and whose remaining scatter therefore reflects measurement noise rather than a real effect. Conclusions are stated as comparisons against that reference, and Section 3.4 states explicitly the size of effect this design would have detected. Were the grid repeated with several data splits, an analysis of variance over the three experimental factors would be the natural test to apply.</w:t>
+      </w:r>
+    </w:p>
+    <w:p>
+      <w:r>
+        <w:rPr>
+          <w:rFonts w:ascii="Times New Roman" w:hAnsi="Times New Roman"/>
+          <w:b w:val="0"/>
+          <w:i w:val="0"/>
+          <w:sz w:val="24"/>
+        </w:rPr>
+        <w:t>Analyses and figures were produced with Python 3.11.15 using numpy 2.4.6, rouge-score 0.1.2 and matplotlib 3.11.1. The scripts that generate every number and figure reported here, scripts/analyze_interaction.py and scripts/plot_results.py, are archived in the project repository alongside the logs they read, so the whole analysis can be regenerated from the committed data.</w:t>
+      </w:r>
+    </w:p>
+    <w:p>
+      <w:r>
+        <w:rPr>
+          <w:rFonts w:ascii="Times New Roman" w:hAnsi="Times New Roman"/>
+          <w:b/>
+          <w:i w:val="0"/>
+          <w:sz w:val="26"/>
+        </w:rPr>
+        <w:t>2.9 Data management</w:t>
       </w:r>
     </w:p>
     <w:p>

</xml_diff>